<commit_message>
Add Proof of Findings section with Azure Portal navigation paths
Each Critical/High finding now includes the exact portal click-path,
the read-only verification command, and the expected on-screen evidence,
so findings can be independently reproduced for board review.

Co-Authored-By: Claude Sonnet 4.6 <noreply@anthropic.com>
Claude-Session: https://claude.ai/code/session_011EypUtkMGzBANHK9MVpP5X
</commit_message>
<xml_diff>
--- a/Azure_Posture_Assessment_Report.docx
+++ b/Azure_Posture_Assessment_Report.docx
@@ -1149,7 +1149,7 @@
         <w:pStyle w:val="ListBullet"/>
       </w:pPr>
       <w:r>
-        <w:t>9. Methodology &amp; Constraints</w:t>
+        <w:t>9. Proof of Findings — Verification &amp; Azure Portal Navigation</w:t>
       </w:r>
     </w:p>
     <w:p>
@@ -1157,7 +1157,15 @@
         <w:pStyle w:val="ListBullet"/>
       </w:pPr>
       <w:r>
-        <w:t>10. Prepared Remediation Scripts (NOT executed — pending approval)</w:t>
+        <w:t>10. Methodology &amp; Constraints</w:t>
+      </w:r>
+    </w:p>
+    <w:p>
+      <w:pPr>
+        <w:pStyle w:val="ListBullet"/>
+      </w:pPr>
+      <w:r>
+        <w:t>11. Prepared Remediation Scripts (NOT executed — pending approval)</w:t>
       </w:r>
     </w:p>
     <w:p>
@@ -12109,7 +12117,533 @@
         <w:pStyle w:val="Heading1"/>
       </w:pPr>
       <w:r>
-        <w:t>9. Methodology &amp; Constraints</w:t>
+        <w:t>9. Proof of Findings — Verification &amp; Azure Portal Navigation</w:t>
+      </w:r>
+    </w:p>
+    <w:p>
+      <w:r>
+        <w:rPr>
+          <w:b w:val="0"/>
+          <w:i w:val="0"/>
+        </w:rPr>
+        <w:t>This section gives the exact Azure Portal click-path and the exact PowerShell command used to independently verify each Critical and High finding in this report. Anyone with Reader access on either subscription can reproduce every result below in under two minutes per item. Screenshots were not captured during this engagement (Cloud Shell, no storage account); the navigation paths below let the board, IT, or an auditor reproduce the evidence live on screen.</w:t>
+      </w:r>
+    </w:p>
+    <w:p>
+      <w:r>
+        <w:rPr>
+          <w:b/>
+          <w:sz w:val="24"/>
+        </w:rPr>
+        <w:t xml:space="preserve">9.1. Orphaned Owner at subscription root (Object ID e1cb2806-...)  </w:t>
+      </w:r>
+      <w:r>
+        <w:rPr>
+          <w:b/>
+          <w:color w:val="C00000"/>
+        </w:rPr>
+        <w:t>[Critical]</w:t>
+      </w:r>
+    </w:p>
+    <w:p>
+      <w:r>
+        <w:rPr>
+          <w:b/>
+        </w:rPr>
+        <w:t xml:space="preserve">Portal navigation: </w:t>
+      </w:r>
+      <w:r>
+        <w:t>Portal → Subscriptions → select subscription (“Azure Pass - Sponsorship” or “gipl-azure-subscription”) → Access control (IAM) → Role assignments tab → sort by “Type” or look for a row where the Name column shows “Identity not found” instead of a person's name.</w:t>
+      </w:r>
+    </w:p>
+    <w:p>
+      <w:r>
+        <w:rPr>
+          <w:b/>
+        </w:rPr>
+        <w:t xml:space="preserve">Verification command (read-only): </w:t>
+      </w:r>
+    </w:p>
+    <w:p>
+      <w:r>
+        <w:rPr>
+          <w:rFonts w:ascii="Consolas" w:hAnsi="Consolas"/>
+          <w:sz w:val="18"/>
+        </w:rPr>
+        <w:t>Get-AzRoleAssignment | Where-Object { [string]::IsNullOrEmpty($_.DisplayName) -and $_.RoleDefinitionName -eq "Owner" }</w:t>
+      </w:r>
+    </w:p>
+    <w:p>
+      <w:r>
+        <w:rPr>
+          <w:b/>
+        </w:rPr>
+        <w:t xml:space="preserve">Expected evidence on screen: </w:t>
+      </w:r>
+      <w:r>
+        <w:t>A role assignment row with RoleDefinitionName = Owner, Scope = subscription root, and a blank DisplayName/SignInName — the Portal will show this principal as “Identity not found” in red text.</w:t>
+      </w:r>
+    </w:p>
+    <w:p/>
+    <w:p>
+      <w:r>
+        <w:rPr>
+          <w:b/>
+          <w:sz w:val="24"/>
+        </w:rPr>
+        <w:t xml:space="preserve">9.2. Key Vault kv-azureosi540118198852 — public access, no firewall, no RBAC  </w:t>
+      </w:r>
+      <w:r>
+        <w:rPr>
+          <w:b/>
+          <w:color w:val="C00000"/>
+        </w:rPr>
+        <w:t>[Critical]</w:t>
+      </w:r>
+    </w:p>
+    <w:p>
+      <w:r>
+        <w:rPr>
+          <w:b/>
+        </w:rPr>
+        <w:t xml:space="preserve">Portal navigation: </w:t>
+      </w:r>
+      <w:r>
+        <w:t>Portal → Key vaults → kv-azureosi540118198852 → Networking (left blade) shows “Allow public access from all networks”; → Access configuration (left blade) shows “Permission model: Vault access policy” instead of “Azure role-based access control”; → Properties shows “Purge protection: Disabled”.</w:t>
+      </w:r>
+    </w:p>
+    <w:p>
+      <w:r>
+        <w:rPr>
+          <w:b/>
+        </w:rPr>
+        <w:t xml:space="preserve">Verification command (read-only): </w:t>
+      </w:r>
+    </w:p>
+    <w:p>
+      <w:r>
+        <w:rPr>
+          <w:rFonts w:ascii="Consolas" w:hAnsi="Consolas"/>
+          <w:sz w:val="18"/>
+        </w:rPr>
+        <w:t>Get-AzKeyVault -VaultName "kv-azureosi540118198852" -ResourceGroupName "gipl-slice-ml-india" | Select-Object VaultName, EnableRbacAuthorization, PublicNetworkAccess, EnablePurgeProtection</w:t>
+      </w:r>
+    </w:p>
+    <w:p>
+      <w:r>
+        <w:rPr>
+          <w:b/>
+        </w:rPr>
+        <w:t xml:space="preserve">Expected evidence on screen: </w:t>
+      </w:r>
+      <w:r>
+        <w:t>EnableRbacAuthorization = False, PublicNetworkAccess = Enabled, EnablePurgeProtection = blank/False.</w:t>
+      </w:r>
+    </w:p>
+    <w:p/>
+    <w:p>
+      <w:r>
+        <w:rPr>
+          <w:b/>
+          <w:sz w:val="24"/>
+        </w:rPr>
+        <w:t xml:space="preserve">9.3. No Log Analytics workspace / no audit trail in either subscription  </w:t>
+      </w:r>
+      <w:r>
+        <w:rPr>
+          <w:b/>
+          <w:color w:val="C00000"/>
+        </w:rPr>
+        <w:t>[Critical]</w:t>
+      </w:r>
+    </w:p>
+    <w:p>
+      <w:r>
+        <w:rPr>
+          <w:b/>
+        </w:rPr>
+        <w:t xml:space="preserve">Portal navigation: </w:t>
+      </w:r>
+      <w:r>
+        <w:t>Portal → switch to each subscription → Log Analytics workspaces (search in top bar) → filtered to the subscription → empty list (“No Log Analytics workspaces to display”).</w:t>
+      </w:r>
+    </w:p>
+    <w:p>
+      <w:r>
+        <w:rPr>
+          <w:b/>
+        </w:rPr>
+        <w:t xml:space="preserve">Verification command (read-only): </w:t>
+      </w:r>
+    </w:p>
+    <w:p>
+      <w:r>
+        <w:rPr>
+          <w:rFonts w:ascii="Consolas" w:hAnsi="Consolas"/>
+          <w:sz w:val="18"/>
+        </w:rPr>
+        <w:t>Get-AzOperationalInsightsWorkspace -ErrorAction SilentlyContinue</w:t>
+      </w:r>
+    </w:p>
+    <w:p>
+      <w:r>
+        <w:rPr>
+          <w:b/>
+        </w:rPr>
+        <w:t xml:space="preserve">Expected evidence on screen: </w:t>
+      </w:r>
+      <w:r>
+        <w:t>Empty result set when run against either subscription context — confirms zero workspaces exist to receive diagnostic logs.</w:t>
+      </w:r>
+    </w:p>
+    <w:p/>
+    <w:p>
+      <w:r>
+        <w:rPr>
+          <w:b/>
+          <w:sz w:val="24"/>
+        </w:rPr>
+        <w:t xml:space="preserve">9.4. AI / Cognitive Services accounts — public network access enabled (10 of 10)  </w:t>
+      </w:r>
+      <w:r>
+        <w:rPr>
+          <w:b/>
+          <w:color w:val="C00000"/>
+        </w:rPr>
+        <w:t>[Critical]</w:t>
+      </w:r>
+    </w:p>
+    <w:p>
+      <w:r>
+        <w:rPr>
+          <w:b/>
+        </w:rPr>
+        <w:t xml:space="preserve">Portal navigation: </w:t>
+      </w:r>
+      <w:r>
+        <w:t>Portal → Azure AI services / Cognitive Services → select any of the 10 accounts listed in Section 8.1 (e.g., de-ml-anthropic-resource) → Resource Management → Networking → shows “All networks, including the internet, can access this resource.”</w:t>
+      </w:r>
+    </w:p>
+    <w:p>
+      <w:r>
+        <w:rPr>
+          <w:b/>
+        </w:rPr>
+        <w:t xml:space="preserve">Verification command (read-only): </w:t>
+      </w:r>
+    </w:p>
+    <w:p>
+      <w:r>
+        <w:rPr>
+          <w:rFonts w:ascii="Consolas" w:hAnsi="Consolas"/>
+          <w:sz w:val="18"/>
+        </w:rPr>
+        <w:t>Get-AzCognitiveServicesAccount -ResourceGroupName "gipl-slice-ml-india" -Name "de-ml-anthropic-resource" | Select-Object AccountName, PublicNetworkAccess</w:t>
+      </w:r>
+    </w:p>
+    <w:p>
+      <w:r>
+        <w:rPr>
+          <w:b/>
+        </w:rPr>
+        <w:t xml:space="preserve">Expected evidence on screen: </w:t>
+      </w:r>
+      <w:r>
+        <w:t>PublicNetworkAccess = Enabled, repeatable for each of the 10 named accounts in Section 8.1.</w:t>
+      </w:r>
+    </w:p>
+    <w:p/>
+    <w:p>
+      <w:r>
+        <w:rPr>
+          <w:b/>
+          <w:sz w:val="24"/>
+        </w:rPr>
+        <w:t xml:space="preserve">9.5. Storage accounts — no network restriction, shared key access enabled  </w:t>
+      </w:r>
+      <w:r>
+        <w:rPr>
+          <w:b/>
+          <w:color w:val="E97132"/>
+        </w:rPr>
+        <w:t>[High]</w:t>
+      </w:r>
+    </w:p>
+    <w:p>
+      <w:r>
+        <w:rPr>
+          <w:b/>
+        </w:rPr>
+        <w:t xml:space="preserve">Portal navigation: </w:t>
+      </w:r>
+      <w:r>
+        <w:t>Portal → Storage accounts → stazureosiai540118198852 (or siemstorageaccount1) → Networking → “Public network access” = Enabled from all networks; → Configuration → “Allow storage account key access” = Enabled.</w:t>
+      </w:r>
+    </w:p>
+    <w:p>
+      <w:r>
+        <w:rPr>
+          <w:b/>
+        </w:rPr>
+        <w:t xml:space="preserve">Verification command (read-only): </w:t>
+      </w:r>
+    </w:p>
+    <w:p>
+      <w:r>
+        <w:rPr>
+          <w:rFonts w:ascii="Consolas" w:hAnsi="Consolas"/>
+          <w:sz w:val="18"/>
+        </w:rPr>
+        <w:t>Get-AzStorageAccount -ResourceGroupName "gipl-slice-ml-india" -Name "stazureosiai540118198852" | Select-Object StorageAccountName, AllowSharedKeyAccess, @{N="DefaultAction";E={$_.NetworkRuleSet.DefaultAction}}</w:t>
+      </w:r>
+    </w:p>
+    <w:p>
+      <w:r>
+        <w:rPr>
+          <w:b/>
+        </w:rPr>
+        <w:t xml:space="preserve">Expected evidence on screen: </w:t>
+      </w:r>
+      <w:r>
+        <w:t>AllowSharedKeyAccess = True (or blank, which defaults to enabled), DefaultAction = Allow.</w:t>
+      </w:r>
+    </w:p>
+    <w:p/>
+    <w:p>
+      <w:r>
+        <w:rPr>
+          <w:b/>
+          <w:sz w:val="24"/>
+        </w:rPr>
+        <w:t xml:space="preserve">9.6. Zero resource locks anywhere  </w:t>
+      </w:r>
+      <w:r>
+        <w:rPr>
+          <w:b/>
+          <w:color w:val="E97132"/>
+        </w:rPr>
+        <w:t>[High]</w:t>
+      </w:r>
+    </w:p>
+    <w:p>
+      <w:r>
+        <w:rPr>
+          <w:b/>
+        </w:rPr>
+        <w:t xml:space="preserve">Portal navigation: </w:t>
+      </w:r>
+      <w:r>
+        <w:t>Portal → any resource (e.g., kv-azureosi540118198852) → Settings → Locks (left blade) → “There are no locks to display.” Repeat at the subscription level: Subscriptions → [subscription] → Resource locks.</w:t>
+      </w:r>
+    </w:p>
+    <w:p>
+      <w:r>
+        <w:rPr>
+          <w:b/>
+        </w:rPr>
+        <w:t xml:space="preserve">Verification command (read-only): </w:t>
+      </w:r>
+    </w:p>
+    <w:p>
+      <w:r>
+        <w:rPr>
+          <w:rFonts w:ascii="Consolas" w:hAnsi="Consolas"/>
+          <w:sz w:val="18"/>
+        </w:rPr>
+        <w:t>Get-AzResourceLock</w:t>
+      </w:r>
+    </w:p>
+    <w:p>
+      <w:r>
+        <w:rPr>
+          <w:b/>
+        </w:rPr>
+        <w:t xml:space="preserve">Expected evidence on screen: </w:t>
+      </w:r>
+      <w:r>
+        <w:t>Empty result set across both subscriptions — confirms no CanNotDelete or ReadOnly locks exist on any resource.</w:t>
+      </w:r>
+    </w:p>
+    <w:p/>
+    <w:p>
+      <w:r>
+        <w:rPr>
+          <w:b/>
+          <w:sz w:val="24"/>
+        </w:rPr>
+        <w:t xml:space="preserve">9.7. 5 additional orphaned role assignments  </w:t>
+      </w:r>
+      <w:r>
+        <w:rPr>
+          <w:b/>
+          <w:color w:val="E97132"/>
+        </w:rPr>
+        <w:t>[High]</w:t>
+      </w:r>
+    </w:p>
+    <w:p>
+      <w:r>
+        <w:rPr>
+          <w:b/>
+        </w:rPr>
+        <w:t xml:space="preserve">Portal navigation: </w:t>
+      </w:r>
+      <w:r>
+        <w:t>Portal → Subscriptions → [subscription] → Access control (IAM) → Role assignments → look for additional rows showing “Identity not found” beyond the one at subscription root.</w:t>
+      </w:r>
+    </w:p>
+    <w:p>
+      <w:r>
+        <w:rPr>
+          <w:b/>
+        </w:rPr>
+        <w:t xml:space="preserve">Verification command (read-only): </w:t>
+      </w:r>
+    </w:p>
+    <w:p>
+      <w:r>
+        <w:rPr>
+          <w:rFonts w:ascii="Consolas" w:hAnsi="Consolas"/>
+          <w:sz w:val="18"/>
+        </w:rPr>
+        <w:t>Get-AzRoleAssignment | Where-Object { [string]::IsNullOrEmpty($_.DisplayName) -and [string]::IsNullOrEmpty($_.SignInName) }</w:t>
+      </w:r>
+    </w:p>
+    <w:p>
+      <w:r>
+        <w:rPr>
+          <w:b/>
+        </w:rPr>
+        <w:t xml:space="preserve">Expected evidence on screen: </w:t>
+      </w:r>
+      <w:r>
+        <w:t>Returns 6 total rows across both subscriptions (1 Owner + 5 others) with blank DisplayName/SignInName and ObjectIds 3e6afd56-... and 2fdaeb76-... in addition to e1cb2806-....</w:t>
+      </w:r>
+    </w:p>
+    <w:p/>
+    <w:p>
+      <w:r>
+        <w:rPr>
+          <w:b/>
+          <w:sz w:val="24"/>
+        </w:rPr>
+        <w:t xml:space="preserve">9.8. Service principals with broad standing privilege (azure_osi_ai_models, azure_other_models)  </w:t>
+      </w:r>
+      <w:r>
+        <w:rPr>
+          <w:b/>
+          <w:color w:val="E97132"/>
+        </w:rPr>
+        <w:t>[High]</w:t>
+      </w:r>
+    </w:p>
+    <w:p>
+      <w:r>
+        <w:rPr>
+          <w:b/>
+        </w:rPr>
+        <w:t xml:space="preserve">Portal navigation: </w:t>
+      </w:r>
+      <w:r>
+        <w:t>Portal → Subscriptions → [gipl-azure-subscription] → Access control (IAM) → Role assignments → filter Type = “App” → locate azure_osi_ai_models and azure_other_models → note multiple roles (Contributor, Key Vault Administrator, Storage Blob/File/Table Data Contributor) held by the same principal across different resources.</w:t>
+      </w:r>
+    </w:p>
+    <w:p>
+      <w:r>
+        <w:rPr>
+          <w:b/>
+        </w:rPr>
+        <w:t xml:space="preserve">Verification command (read-only): </w:t>
+      </w:r>
+    </w:p>
+    <w:p>
+      <w:r>
+        <w:rPr>
+          <w:rFonts w:ascii="Consolas" w:hAnsi="Consolas"/>
+          <w:sz w:val="18"/>
+        </w:rPr>
+        <w:t>Get-AzRoleAssignment | Where-Object { $_.ObjectType -eq "ServicePrincipal" -and $_.DisplayName -in @("azure_osi_ai_models","azure_other_models") } | Select-Object DisplayName, RoleDefinitionName, Scope</w:t>
+      </w:r>
+    </w:p>
+    <w:p>
+      <w:r>
+        <w:rPr>
+          <w:b/>
+        </w:rPr>
+        <w:t xml:space="preserve">Expected evidence on screen: </w:t>
+      </w:r>
+      <w:r>
+        <w:t>Each service principal shows 5+ distinct role assignments spanning Contributor, Key Vault Administrator, and three different Storage Data roles.</w:t>
+      </w:r>
+    </w:p>
+    <w:p/>
+    <w:p>
+      <w:r>
+        <w:rPr>
+          <w:b/>
+          <w:sz w:val="24"/>
+        </w:rPr>
+        <w:t xml:space="preserve">9.9. No tagging enforcement policy / 26.9% resources untagged  </w:t>
+      </w:r>
+      <w:r>
+        <w:rPr>
+          <w:b/>
+          <w:color w:val="FFC000"/>
+        </w:rPr>
+        <w:t>[Medium]</w:t>
+      </w:r>
+    </w:p>
+    <w:p>
+      <w:r>
+        <w:rPr>
+          <w:b/>
+        </w:rPr>
+        <w:t xml:space="preserve">Portal navigation: </w:t>
+      </w:r>
+      <w:r>
+        <w:t>Portal → Policy → Definitions (or Assignments) → filtered to either subscription → confirm only “sys.blockwesteurope” and the Defender “SecurityCenterBuiltIn” assignment exist, no tag-related policy assignment. Then: Resource groups → [each RG] → Tags blade shows blank for 4 of 5 RGs.</w:t>
+      </w:r>
+    </w:p>
+    <w:p>
+      <w:r>
+        <w:rPr>
+          <w:b/>
+        </w:rPr>
+        <w:t xml:space="preserve">Verification command (read-only): </w:t>
+      </w:r>
+    </w:p>
+    <w:p>
+      <w:r>
+        <w:rPr>
+          <w:rFonts w:ascii="Consolas" w:hAnsi="Consolas"/>
+          <w:sz w:val="18"/>
+        </w:rPr>
+        <w:t>Get-AzPolicyAssignment | Select-Object Name | Where-Object { $_.Name -match "tag" }</w:t>
+      </w:r>
+    </w:p>
+    <w:p>
+      <w:r>
+        <w:rPr>
+          <w:b/>
+        </w:rPr>
+        <w:t xml:space="preserve">Expected evidence on screen: </w:t>
+      </w:r>
+      <w:r>
+        <w:t>Empty result — confirms no tagging policy is assigned in either subscription.</w:t>
+      </w:r>
+    </w:p>
+    <w:p/>
+    <w:p>
+      <w:r>
+        <w:br w:type="page"/>
+      </w:r>
+    </w:p>
+    <w:p>
+      <w:pPr>
+        <w:pStyle w:val="Heading1"/>
+      </w:pPr>
+      <w:r>
+        <w:t>10. Methodology &amp; Constraints</w:t>
       </w:r>
     </w:p>
     <w:p>
@@ -12170,7 +12704,7 @@
         <w:pStyle w:val="Heading1"/>
       </w:pPr>
       <w:r>
-        <w:t>10. Prepared Remediation Scripts — NOT EXECUTED, Pending Approval</w:t>
+        <w:t>11. Prepared Remediation Scripts — NOT EXECUTED, Pending Approval</w:t>
       </w:r>
     </w:p>
     <w:p>

</xml_diff>

<commit_message>
Expand remediation section into full roadmap with ownership and rollback
Adds phased timeline, named ownership/approval matrix, and per-item
pre-requisites/validation/rollback detail to the remediation section.
All remediation scripts remain prepared-but-unexecuted pending approval.

Co-Authored-By: Claude Sonnet 4.6 <noreply@anthropic.com>
Claude-Session: https://claude.ai/code/session_011EypUtkMGzBANHK9MVpP5X
</commit_message>
<xml_diff>
--- a/Azure_Posture_Assessment_Report.docx
+++ b/Azure_Posture_Assessment_Report.docx
@@ -12704,7 +12704,7 @@
         <w:pStyle w:val="Heading1"/>
       </w:pPr>
       <w:r>
-        <w:t>11. Prepared Remediation Scripts — NOT EXECUTED, Pending Approval</w:t>
+        <w:t>11. Remediation Roadmap — NOT EXECUTED, Pending Approval</w:t>
       </w:r>
     </w:p>
     <w:p>
@@ -12713,7 +12713,608 @@
           <w:b w:val="0"/>
           <w:i/>
         </w:rPr>
-        <w:t>Each script below targets a specific named resource or principal identified in this report. None have been run. Each requires management approval, change-control sign-off, and validation in a non-production context before execution.</w:t>
+        <w:t>This section is a complete remediation plan, not just a script library: a phased timeline, an ownership model, and — for every item — the pre-requisites, the exact command, how to validate the fix worked, and how to roll it back if something breaks. Nothing in this section has been run. Every command requires management approval, change-control sign-off, and validation in a non-production context first.</w:t>
+      </w:r>
+    </w:p>
+    <w:p>
+      <w:pPr>
+        <w:pStyle w:val="Heading2"/>
+      </w:pPr>
+      <w:r>
+        <w:t>11.1 Phased Roadmap</w:t>
+      </w:r>
+    </w:p>
+    <w:tbl>
+      <w:tblPr>
+        <w:tblStyle w:val="LightGrid-Accent1"/>
+        <w:tblW w:type="auto" w:w="0"/>
+        <w:jc w:val="center"/>
+        <w:tblLook w:firstColumn="1" w:firstRow="1" w:lastColumn="0" w:lastRow="0" w:noHBand="0" w:noVBand="1" w:val="04A0"/>
+      </w:tblPr>
+      <w:tblGrid>
+        <w:gridCol w:w="2880"/>
+        <w:gridCol w:w="2880"/>
+        <w:gridCol w:w="2880"/>
+      </w:tblGrid>
+      <w:tr>
+        <w:tc>
+          <w:tcPr>
+            <w:tcW w:type="dxa" w:w="2880"/>
+          </w:tcPr>
+          <w:p>
+            <w:r>
+              <w:rPr>
+                <w:b/>
+                <w:sz w:val="18"/>
+              </w:rPr>
+              <w:t>Phase</w:t>
+            </w:r>
+          </w:p>
+        </w:tc>
+        <w:tc>
+          <w:tcPr>
+            <w:tcW w:type="dxa" w:w="2880"/>
+          </w:tcPr>
+          <w:p>
+            <w:r>
+              <w:rPr>
+                <w:b/>
+                <w:sz w:val="18"/>
+              </w:rPr>
+              <w:t>Items</w:t>
+            </w:r>
+          </w:p>
+        </w:tc>
+        <w:tc>
+          <w:tcPr>
+            <w:tcW w:type="dxa" w:w="2880"/>
+          </w:tcPr>
+          <w:p>
+            <w:r>
+              <w:rPr>
+                <w:b/>
+                <w:sz w:val="18"/>
+              </w:rPr>
+              <w:t>Rationale / Risk Level</w:t>
+            </w:r>
+          </w:p>
+        </w:tc>
+      </w:tr>
+      <w:tr>
+        <w:tc>
+          <w:tcPr>
+            <w:tcW w:type="dxa" w:w="2880"/>
+          </w:tcPr>
+          <w:p>
+            <w:r>
+              <w:rPr>
+                <w:sz w:val="18"/>
+              </w:rPr>
+              <w:t>Phase 0 — Immediate (0–3 days)</w:t>
+            </w:r>
+          </w:p>
+        </w:tc>
+        <w:tc>
+          <w:tcPr>
+            <w:tcW w:type="dxa" w:w="2880"/>
+          </w:tcPr>
+          <w:p>
+            <w:r>
+              <w:rPr>
+                <w:sz w:val="18"/>
+              </w:rPr>
+              <w:t>R1, R5, R10 (locks on Key Vault only)</w:t>
+            </w:r>
+          </w:p>
+        </w:tc>
+        <w:tc>
+          <w:tcPr>
+            <w:tcW w:type="dxa" w:w="2880"/>
+          </w:tcPr>
+          <w:p>
+            <w:r>
+              <w:rPr>
+                <w:sz w:val="18"/>
+              </w:rPr>
+              <w:t>Stop the bleeding: remove unidentified standing access, lock the Key Vault against deletion. Zero downtime risk.</w:t>
+            </w:r>
+          </w:p>
+        </w:tc>
+      </w:tr>
+      <w:tr>
+        <w:tc>
+          <w:tcPr>
+            <w:tcW w:type="dxa" w:w="2880"/>
+          </w:tcPr>
+          <w:p>
+            <w:r>
+              <w:rPr>
+                <w:sz w:val="18"/>
+              </w:rPr>
+              <w:t>Phase 1 — Week 1</w:t>
+            </w:r>
+          </w:p>
+        </w:tc>
+        <w:tc>
+          <w:tcPr>
+            <w:tcW w:type="dxa" w:w="2880"/>
+          </w:tcPr>
+          <w:p>
+            <w:r>
+              <w:rPr>
+                <w:sz w:val="18"/>
+              </w:rPr>
+              <w:t>R2, R3 (security contact + Log Analytics workspace only)</w:t>
+            </w:r>
+          </w:p>
+        </w:tc>
+        <w:tc>
+          <w:tcPr>
+            <w:tcW w:type="dxa" w:w="2880"/>
+          </w:tcPr>
+          <w:p>
+            <w:r>
+              <w:rPr>
+                <w:sz w:val="18"/>
+              </w:rPr>
+              <w:t>Harden the Key Vault, stand up logging infrastructure. No application changes yet — purely additive.</w:t>
+            </w:r>
+          </w:p>
+        </w:tc>
+      </w:tr>
+      <w:tr>
+        <w:tc>
+          <w:tcPr>
+            <w:tcW w:type="dxa" w:w="2880"/>
+          </w:tcPr>
+          <w:p>
+            <w:r>
+              <w:rPr>
+                <w:sz w:val="18"/>
+              </w:rPr>
+              <w:t>Phase 2 — Weeks 2–4</w:t>
+            </w:r>
+          </w:p>
+        </w:tc>
+        <w:tc>
+          <w:tcPr>
+            <w:tcW w:type="dxa" w:w="2880"/>
+          </w:tcPr>
+          <w:p>
+            <w:r>
+              <w:rPr>
+                <w:sz w:val="18"/>
+              </w:rPr>
+              <w:t>R3 (diagnostics wiring), R6, R8, R11</w:t>
+            </w:r>
+          </w:p>
+        </w:tc>
+        <w:tc>
+          <w:tcPr>
+            <w:tcW w:type="dxa" w:w="2880"/>
+          </w:tcPr>
+          <w:p>
+            <w:r>
+              <w:rPr>
+                <w:sz w:val="18"/>
+              </w:rPr>
+              <w:t>Turn on audit trails across all resources; restrict storage network access and shared-key auth; enable Soft Delete. Requires app teams to confirm they don't depend on shared keys.</w:t>
+            </w:r>
+          </w:p>
+        </w:tc>
+      </w:tr>
+      <w:tr>
+        <w:tc>
+          <w:tcPr>
+            <w:tcW w:type="dxa" w:w="2880"/>
+          </w:tcPr>
+          <w:p>
+            <w:r>
+              <w:rPr>
+                <w:sz w:val="18"/>
+              </w:rPr>
+              <w:t>Phase 3 — Weeks 4–8</w:t>
+            </w:r>
+          </w:p>
+        </w:tc>
+        <w:tc>
+          <w:tcPr>
+            <w:tcW w:type="dxa" w:w="2880"/>
+          </w:tcPr>
+          <w:p>
+            <w:r>
+              <w:rPr>
+                <w:sz w:val="18"/>
+              </w:rPr>
+              <w:t>R4/R9, R7</w:t>
+            </w:r>
+          </w:p>
+        </w:tc>
+        <w:tc>
+          <w:tcPr>
+            <w:tcW w:type="dxa" w:w="2880"/>
+          </w:tcPr>
+          <w:p>
+            <w:r>
+              <w:rPr>
+                <w:sz w:val="18"/>
+              </w:rPr>
+              <w:t>Move AI accounts and ML workspaces behind Private Link and disable public access; right-size service principal permissions. Highest change-risk phase — requires Private Endpoint/DNS pre-work and app-team coordination to avoid breaking integrations.</w:t>
+            </w:r>
+          </w:p>
+        </w:tc>
+      </w:tr>
+      <w:tr>
+        <w:tc>
+          <w:tcPr>
+            <w:tcW w:type="dxa" w:w="2880"/>
+          </w:tcPr>
+          <w:p>
+            <w:r>
+              <w:rPr>
+                <w:sz w:val="18"/>
+              </w:rPr>
+              <w:t>Phase 4 — Ongoing</w:t>
+            </w:r>
+          </w:p>
+        </w:tc>
+        <w:tc>
+          <w:tcPr>
+            <w:tcW w:type="dxa" w:w="2880"/>
+          </w:tcPr>
+          <w:p>
+            <w:r>
+              <w:rPr>
+                <w:sz w:val="18"/>
+              </w:rPr>
+              <w:t>R12, R13, recertification</w:t>
+            </w:r>
+          </w:p>
+        </w:tc>
+        <w:tc>
+          <w:tcPr>
+            <w:tcW w:type="dxa" w:w="2880"/>
+          </w:tcPr>
+          <w:p>
+            <w:r>
+              <w:rPr>
+                <w:sz w:val="18"/>
+              </w:rPr>
+              <w:t>Tagging policy enforcement, quarterly access recertification, and quarterly re-run of this assessment to track drift.</w:t>
+            </w:r>
+          </w:p>
+        </w:tc>
+      </w:tr>
+    </w:tbl>
+    <w:p/>
+    <w:p>
+      <w:pPr>
+        <w:pStyle w:val="Heading2"/>
+      </w:pPr>
+      <w:r>
+        <w:t>11.2 Ownership &amp; Approval Model (proposed — adjust to your org chart)</w:t>
+      </w:r>
+    </w:p>
+    <w:tbl>
+      <w:tblPr>
+        <w:tblStyle w:val="LightGrid-Accent1"/>
+        <w:tblW w:type="auto" w:w="0"/>
+        <w:jc w:val="center"/>
+        <w:tblLook w:firstColumn="1" w:firstRow="1" w:lastColumn="0" w:lastRow="0" w:noHBand="0" w:noVBand="1" w:val="04A0"/>
+      </w:tblPr>
+      <w:tblGrid>
+        <w:gridCol w:w="2160"/>
+        <w:gridCol w:w="2160"/>
+        <w:gridCol w:w="2160"/>
+        <w:gridCol w:w="2160"/>
+      </w:tblGrid>
+      <w:tr>
+        <w:tc>
+          <w:tcPr>
+            <w:tcW w:type="dxa" w:w="2160"/>
+          </w:tcPr>
+          <w:p>
+            <w:r>
+              <w:rPr>
+                <w:b/>
+                <w:sz w:val="18"/>
+              </w:rPr>
+              <w:t>Remediation Items</w:t>
+            </w:r>
+          </w:p>
+        </w:tc>
+        <w:tc>
+          <w:tcPr>
+            <w:tcW w:type="dxa" w:w="2160"/>
+          </w:tcPr>
+          <w:p>
+            <w:r>
+              <w:rPr>
+                <w:b/>
+                <w:sz w:val="18"/>
+              </w:rPr>
+              <w:t>Suggested Executor</w:t>
+            </w:r>
+          </w:p>
+        </w:tc>
+        <w:tc>
+          <w:tcPr>
+            <w:tcW w:type="dxa" w:w="2160"/>
+          </w:tcPr>
+          <w:p>
+            <w:r>
+              <w:rPr>
+                <w:b/>
+                <w:sz w:val="18"/>
+              </w:rPr>
+              <w:t>Suggested Approver</w:t>
+            </w:r>
+          </w:p>
+        </w:tc>
+        <w:tc>
+          <w:tcPr>
+            <w:tcW w:type="dxa" w:w="2160"/>
+          </w:tcPr>
+          <w:p>
+            <w:r>
+              <w:rPr>
+                <w:b/>
+                <w:sz w:val="18"/>
+              </w:rPr>
+              <w:t>Required Sign-off</w:t>
+            </w:r>
+          </w:p>
+        </w:tc>
+      </w:tr>
+      <w:tr>
+        <w:tc>
+          <w:tcPr>
+            <w:tcW w:type="dxa" w:w="2160"/>
+          </w:tcPr>
+          <w:p>
+            <w:r>
+              <w:rPr>
+                <w:sz w:val="18"/>
+              </w:rPr>
+              <w:t>R1, R5, R7 (identity changes)</w:t>
+            </w:r>
+          </w:p>
+        </w:tc>
+        <w:tc>
+          <w:tcPr>
+            <w:tcW w:type="dxa" w:w="2160"/>
+          </w:tcPr>
+          <w:p>
+            <w:r>
+              <w:rPr>
+                <w:sz w:val="18"/>
+              </w:rPr>
+              <w:t>Identity/IAM owner (e.g., Dev Kudtharkar or Rakshan Shetty — current User Access Administrators)</w:t>
+            </w:r>
+          </w:p>
+        </w:tc>
+        <w:tc>
+          <w:tcPr>
+            <w:tcW w:type="dxa" w:w="2160"/>
+          </w:tcPr>
+          <w:p>
+            <w:r>
+              <w:rPr>
+                <w:sz w:val="18"/>
+              </w:rPr>
+              <w:t>Subscription Owner</w:t>
+            </w:r>
+          </w:p>
+        </w:tc>
+        <w:tc>
+          <w:tcPr>
+            <w:tcW w:type="dxa" w:w="2160"/>
+          </w:tcPr>
+          <w:p>
+            <w:r>
+              <w:rPr>
+                <w:sz w:val="18"/>
+              </w:rPr>
+              <w:t>CAB / change ticket</w:t>
+            </w:r>
+          </w:p>
+        </w:tc>
+      </w:tr>
+      <w:tr>
+        <w:tc>
+          <w:tcPr>
+            <w:tcW w:type="dxa" w:w="2160"/>
+          </w:tcPr>
+          <w:p>
+            <w:r>
+              <w:rPr>
+                <w:sz w:val="18"/>
+              </w:rPr>
+              <w:t>R2, R3, R6, R8, R11 (data-plane hardening)</w:t>
+            </w:r>
+          </w:p>
+        </w:tc>
+        <w:tc>
+          <w:tcPr>
+            <w:tcW w:type="dxa" w:w="2160"/>
+          </w:tcPr>
+          <w:p>
+            <w:r>
+              <w:rPr>
+                <w:sz w:val="18"/>
+              </w:rPr>
+              <w:t>Platform/Infra engineer on gipl-slice-ml-india</w:t>
+            </w:r>
+          </w:p>
+        </w:tc>
+        <w:tc>
+          <w:tcPr>
+            <w:tcW w:type="dxa" w:w="2160"/>
+          </w:tcPr>
+          <w:p>
+            <w:r>
+              <w:rPr>
+                <w:sz w:val="18"/>
+              </w:rPr>
+              <w:t>Engineering Lead</w:t>
+            </w:r>
+          </w:p>
+        </w:tc>
+        <w:tc>
+          <w:tcPr>
+            <w:tcW w:type="dxa" w:w="2160"/>
+          </w:tcPr>
+          <w:p>
+            <w:r>
+              <w:rPr>
+                <w:sz w:val="18"/>
+              </w:rPr>
+              <w:t>Change ticket + app-team sign-off</w:t>
+            </w:r>
+          </w:p>
+        </w:tc>
+      </w:tr>
+      <w:tr>
+        <w:tc>
+          <w:tcPr>
+            <w:tcW w:type="dxa" w:w="2160"/>
+          </w:tcPr>
+          <w:p>
+            <w:r>
+              <w:rPr>
+                <w:sz w:val="18"/>
+              </w:rPr>
+              <w:t>R4/R9 (network isolation)</w:t>
+            </w:r>
+          </w:p>
+        </w:tc>
+        <w:tc>
+          <w:tcPr>
+            <w:tcW w:type="dxa" w:w="2160"/>
+          </w:tcPr>
+          <w:p>
+            <w:r>
+              <w:rPr>
+                <w:sz w:val="18"/>
+              </w:rPr>
+              <w:t>Platform/Infra engineer + AI/ML app owners (Pranay Devasani, Venkat V, Hardikkumar Patel)</w:t>
+            </w:r>
+          </w:p>
+        </w:tc>
+        <w:tc>
+          <w:tcPr>
+            <w:tcW w:type="dxa" w:w="2160"/>
+          </w:tcPr>
+          <w:p>
+            <w:r>
+              <w:rPr>
+                <w:sz w:val="18"/>
+              </w:rPr>
+              <w:t>Engineering Lead + AI/ML product owner</w:t>
+            </w:r>
+          </w:p>
+        </w:tc>
+        <w:tc>
+          <w:tcPr>
+            <w:tcW w:type="dxa" w:w="2160"/>
+          </w:tcPr>
+          <w:p>
+            <w:r>
+              <w:rPr>
+                <w:sz w:val="18"/>
+              </w:rPr>
+              <w:t>CAB + maintenance window</w:t>
+            </w:r>
+          </w:p>
+        </w:tc>
+      </w:tr>
+      <w:tr>
+        <w:tc>
+          <w:tcPr>
+            <w:tcW w:type="dxa" w:w="2160"/>
+          </w:tcPr>
+          <w:p>
+            <w:r>
+              <w:rPr>
+                <w:sz w:val="18"/>
+              </w:rPr>
+              <w:t>R10, R12, R13 (governance)</w:t>
+            </w:r>
+          </w:p>
+        </w:tc>
+        <w:tc>
+          <w:tcPr>
+            <w:tcW w:type="dxa" w:w="2160"/>
+          </w:tcPr>
+          <w:p>
+            <w:r>
+              <w:rPr>
+                <w:sz w:val="18"/>
+              </w:rPr>
+              <w:t>Cloud governance owner</w:t>
+            </w:r>
+          </w:p>
+        </w:tc>
+        <w:tc>
+          <w:tcPr>
+            <w:tcW w:type="dxa" w:w="2160"/>
+          </w:tcPr>
+          <w:p>
+            <w:r>
+              <w:rPr>
+                <w:sz w:val="18"/>
+              </w:rPr>
+              <w:t>Engineering Lead</w:t>
+            </w:r>
+          </w:p>
+        </w:tc>
+        <w:tc>
+          <w:tcPr>
+            <w:tcW w:type="dxa" w:w="2160"/>
+          </w:tcPr>
+          <w:p>
+            <w:r>
+              <w:rPr>
+                <w:sz w:val="18"/>
+              </w:rPr>
+              <w:t>Standard change ticket</w:t>
+            </w:r>
+          </w:p>
+        </w:tc>
+      </w:tr>
+    </w:tbl>
+    <w:p/>
+    <w:p>
+      <w:r>
+        <w:rPr>
+          <w:b w:val="0"/>
+          <w:i/>
+        </w:rPr>
+        <w:t>Note: Dev Kudtharkar and Santosh Kaddu currently hold User Access Administrator at the tenant root and are the only identities with rights to action R1/R5/R7 as-is. Recommend at least two-person approval for any identity-removal action given the elevated blast radius.</w:t>
+      </w:r>
+    </w:p>
+    <w:p>
+      <w:pPr>
+        <w:pStyle w:val="Heading2"/>
+      </w:pPr>
+      <w:r>
+        <w:t>11.3 Detailed Remediation Items</w:t>
+      </w:r>
+    </w:p>
+    <w:p>
+      <w:r>
+        <w:rPr>
+          <w:b/>
+          <w:sz w:val="24"/>
+        </w:rPr>
+        <w:t xml:space="preserve">R1 — Remove orphaned Owner role assignment at subscription root  </w:t>
+      </w:r>
+      <w:r>
+        <w:rPr>
+          <w:b/>
+          <w:color w:val="C00000"/>
+        </w:rPr>
+        <w:t>[Critical]</w:t>
       </w:r>
     </w:p>
     <w:p>
@@ -12726,11 +13327,22 @@
       </w:r>
     </w:p>
     <w:p>
-      <w:pPr>
-        <w:pStyle w:val="Heading3"/>
-      </w:pPr>
       <w:r>
-        <w:t>R1/R5 — Remove orphaned role assignments</w:t>
+        <w:rPr>
+          <w:b/>
+        </w:rPr>
+        <w:t xml:space="preserve">Pre-requisites / sequencing: </w:t>
+      </w:r>
+      <w:r>
+        <w:t>None — this is a pure removal of a non-functioning identity. Confirm via Section 9.1 proof steps immediately beforehand that the principal still resolves to nothing, in case it was somehow restored in the interim.</w:t>
+      </w:r>
+    </w:p>
+    <w:p>
+      <w:r>
+        <w:rPr>
+          <w:b/>
+        </w:rPr>
+        <w:t>Remediation command(s):</w:t>
       </w:r>
     </w:p>
     <w:p>
@@ -12741,12 +13353,56 @@
         </w:rPr>
         <w:t>Remove-AzRoleAssignment -ObjectId "e1cb2806-57c9-435e-bd98-0a4788fa8abf" -RoleDefinitionName "Owner" -Scope "/subscriptions/&lt;sub-id&gt;"</w:t>
         <w:br/>
-        <w:t>Remove-AzRoleAssignment -ObjectId "3e6afd56-3e57-45dc-b795-2fef39e9ceeb" -RoleDefinitionName "Contributor" -Scope "/subscriptions/&lt;sub-id&gt;/resourceGroups/gipl-slice-ml-india"</w:t>
+        <w:t># Run once per subscription (Azure Pass - Sponsorship and gipl-azure-subscription)</w:t>
+      </w:r>
+    </w:p>
+    <w:p>
+      <w:r>
+        <w:rPr>
+          <w:b/>
+        </w:rPr>
+        <w:t xml:space="preserve">Validation after execution: </w:t>
+      </w:r>
+    </w:p>
+    <w:p>
+      <w:r>
+        <w:rPr>
+          <w:rFonts w:ascii="Consolas" w:hAnsi="Consolas"/>
+          <w:sz w:val="18"/>
+        </w:rPr>
+        <w:t>Get-AzRoleAssignment -Scope "/subscriptions/&lt;sub-id&gt;" | Where-Object { $_.ObjectId -eq "e1cb2806-57c9-435e-bd98-0a4788fa8abf" }</w:t>
         <w:br/>
-        <w:t># Repeat for each 2fdaeb76-efd2-4d8a-9354-75c3c3093319 assignment listed in Section 2.2</w:t>
+        <w:t># Expect: empty result set</w:t>
+      </w:r>
+    </w:p>
+    <w:p>
+      <w:r>
+        <w:rPr>
+          <w:b/>
+        </w:rPr>
+        <w:t xml:space="preserve">Rollback if issues occur: </w:t>
+      </w:r>
+      <w:r>
+        <w:t>Role assignments can be re-created instantly if needed: New-AzRoleAssignment -ObjectId &lt;id&gt; -RoleDefinitionName Owner -Scope &lt;scope&gt;. Since the principal is already unresolvable, there is no functional rollback need — nothing currently depends on this identity being able to authenticate.</w:t>
       </w:r>
     </w:p>
     <w:p/>
+    <w:p>
+      <w:r>
+        <w:rPr>
+          <w:b/>
+          <w:sz w:val="24"/>
+        </w:rPr>
+        <w:t xml:space="preserve">R5 — Remove the remaining 5 orphaned role assignments  </w:t>
+      </w:r>
+      <w:r>
+        <w:rPr>
+          <w:b/>
+          <w:color w:val="E97132"/>
+        </w:rPr>
+        <w:t>[High]</w:t>
+      </w:r>
+    </w:p>
     <w:p>
       <w:r>
         <w:rPr>
@@ -12757,11 +13413,22 @@
       </w:r>
     </w:p>
     <w:p>
-      <w:pPr>
-        <w:pStyle w:val="Heading3"/>
-      </w:pPr>
       <w:r>
-        <w:t>R2 — Restrict Key Vault network access (kv-azureosi540118198852)</w:t>
+        <w:rPr>
+          <w:b/>
+        </w:rPr>
+        <w:t xml:space="preserve">Pre-requisites / sequencing: </w:t>
+      </w:r>
+      <w:r>
+        <w:t>None. Same pre-check as R1 — re-verify via Section 9.7 immediately before running.</w:t>
+      </w:r>
+    </w:p>
+    <w:p>
+      <w:r>
+        <w:rPr>
+          <w:b/>
+        </w:rPr>
+        <w:t>Remediation command(s):</w:t>
       </w:r>
     </w:p>
     <w:p>
@@ -12770,12 +13437,64 @@
           <w:rFonts w:ascii="Consolas" w:hAnsi="Consolas"/>
           <w:sz w:val="18"/>
         </w:rPr>
-        <w:t>Update-AzKeyVaultNetworkRuleSet -VaultName "kv-azureosi540118198852" -ResourceGroupName "gipl-slice-ml-india" -DefaultAction Deny -Bypass AzureServices</w:t>
+        <w:t>Remove-AzRoleAssignment -ObjectId "3e6afd56-3e57-45dc-b795-2fef39e9ceeb" -RoleDefinitionName "Contributor" -Scope "/subscriptions/&lt;gipl-sub-id&gt;/resourceGroups/gipl-slice-ml-india"</w:t>
         <w:br/>
-        <w:t>Update-AzKeyVault -VaultName "kv-azureosi540118198852" -ResourceGroupName "gipl-slice-ml-india" -EnablePurgeProtection -EnableRbacAuthorization</w:t>
+        <w:t>Remove-AzRoleAssignment -ObjectId "2fdaeb76-efd2-4d8a-9354-75c3c3093319" -RoleDefinitionName "Reader" -Scope "/subscriptions/&lt;gipl-sub-id&gt;/resourceGroups/gipl-slice-ml-india/providers/Microsoft.CognitiveServices/accounts/da-ml-openai-api"</w:t>
+        <w:br/>
+        <w:t>Remove-AzRoleAssignment -ObjectId "2fdaeb76-efd2-4d8a-9354-75c3c3093319" -RoleDefinitionName "Cost Management Reader" -Scope "/subscriptions/&lt;gipl-sub-id&gt;/resourceGroups/gipl-slice-ml-india/providers/Microsoft.CognitiveServices/accounts/da-ml-openai-api"</w:t>
+        <w:br/>
+        <w:t>Remove-AzRoleAssignment -ObjectId "2fdaeb76-efd2-4d8a-9354-75c3c3093319" -RoleDefinitionName "Cost Management Reader" -Scope "/subscriptions/&lt;gipl-sub-id&gt;"</w:t>
+        <w:br/>
+        <w:t>Remove-AzRoleAssignment -ObjectId "2fdaeb76-efd2-4d8a-9354-75c3c3093319" -RoleDefinitionName "Cost Management Contributor" -Scope "/subscriptions/&lt;gipl-sub-id&gt;"</w:t>
+      </w:r>
+    </w:p>
+    <w:p>
+      <w:r>
+        <w:rPr>
+          <w:b/>
+        </w:rPr>
+        <w:t xml:space="preserve">Validation after execution: </w:t>
+      </w:r>
+    </w:p>
+    <w:p>
+      <w:r>
+        <w:rPr>
+          <w:rFonts w:ascii="Consolas" w:hAnsi="Consolas"/>
+          <w:sz w:val="18"/>
+        </w:rPr>
+        <w:t>Get-AzRoleAssignment | Where-Object { $_.ObjectId -in @("3e6afd56-3e57-45dc-b795-2fef39e9ceeb","2fdaeb76-efd2-4d8a-9354-75c3c3093319") }</w:t>
+        <w:br/>
+        <w:t># Expect: empty result set</w:t>
+      </w:r>
+    </w:p>
+    <w:p>
+      <w:r>
+        <w:rPr>
+          <w:b/>
+        </w:rPr>
+        <w:t xml:space="preserve">Rollback if issues occur: </w:t>
+      </w:r>
+      <w:r>
+        <w:t>Re-grant with New-AzRoleAssignment using the same ObjectId/Role/Scope tuples if a legitimate dependency is discovered post-removal (unlikely, given the orphaned status).</w:t>
       </w:r>
     </w:p>
     <w:p/>
+    <w:p>
+      <w:r>
+        <w:rPr>
+          <w:b/>
+          <w:sz w:val="24"/>
+        </w:rPr>
+        <w:t xml:space="preserve">R2 — Harden Key Vault kv-azureosi540118198852: firewall, RBAC, purge protection  </w:t>
+      </w:r>
+      <w:r>
+        <w:rPr>
+          <w:b/>
+          <w:color w:val="C00000"/>
+        </w:rPr>
+        <w:t>[Critical]</w:t>
+      </w:r>
+    </w:p>
     <w:p>
       <w:r>
         <w:rPr>
@@ -12786,11 +13505,22 @@
       </w:r>
     </w:p>
     <w:p>
-      <w:pPr>
-        <w:pStyle w:val="Heading3"/>
-      </w:pPr>
       <w:r>
-        <w:t>R3 — Create Log Analytics workspace and wire up diagnostics</w:t>
+        <w:rPr>
+          <w:b/>
+        </w:rPr>
+        <w:t xml:space="preserve">Pre-requisites / sequencing: </w:t>
+      </w:r>
+      <w:r>
+        <w:t>Confirm with app owners (azure_osi_ai_models, azure_other_models service principals) which network ranges/Azure services actually need vault access, so the firewall allow-list doesn't break running pipelines. Switching to RBAC authorization will also require re-creating the equivalent access as role assignments — capture current Access Policies first with Get-AzKeyVault before changing the authorization model.</w:t>
+      </w:r>
+    </w:p>
+    <w:p>
+      <w:r>
+        <w:rPr>
+          <w:b/>
+        </w:rPr>
+        <w:t>Remediation command(s):</w:t>
       </w:r>
     </w:p>
     <w:p>
@@ -12799,14 +13529,75 @@
           <w:rFonts w:ascii="Consolas" w:hAnsi="Consolas"/>
           <w:sz w:val="18"/>
         </w:rPr>
-        <w:t>New-AzOperationalInsightsWorkspace -ResourceGroupName &lt;rg&gt; -Name &lt;law-name&gt; -Location &lt;region&gt; -Sku PerGB2018</w:t>
+        <w:t># Step 1: capture current access policies for reference</w:t>
         <w:br/>
-        <w:t># Apply Set-AzDiagnosticSetting to: kv-azureosi540118198852, siemstorageaccount1, stazureosiai540118198852,</w:t>
+        <w:t>Get-AzKeyVault -VaultName "kv-azureosi540118198852" -ResourceGroupName "gipl-slice-ml-india" | Select-Object -ExpandProperty AccessPolicies</w:t>
         <w:br/>
-        <w:t># all 10 named Cognitive Services accounts in Section 8.1, and both ML workspaces in Section 8.2</w:t>
+        <w:br/>
+        <w:t># Step 2: restrict network access (keep Azure services bypass so internal pipelines keep working)</w:t>
+        <w:br/>
+        <w:t>Update-AzKeyVaultNetworkRuleSet -VaultName "kv-azureosi540118198852" -ResourceGroupName "gipl-slice-ml-india" -DefaultAction Deny -Bypass AzureServices</w:t>
+        <w:br/>
+        <w:br/>
+        <w:t># Step 3: enable purge protection (irreversible once set — confirm before running)</w:t>
+        <w:br/>
+        <w:t>Update-AzKeyVault -VaultName "kv-azureosi540118198852" -ResourceGroupName "gipl-slice-ml-india" -EnablePurgeProtection</w:t>
+        <w:br/>
+        <w:br/>
+        <w:t># Step 4 (separate change window): migrate to RBAC authorization once equivalent role assignments are staged</w:t>
+        <w:br/>
+        <w:t>Update-AzKeyVault -VaultName "kv-azureosi540118198852" -ResourceGroupName "gipl-slice-ml-india" -EnableRbacAuthorization</w:t>
+      </w:r>
+    </w:p>
+    <w:p>
+      <w:r>
+        <w:rPr>
+          <w:b/>
+        </w:rPr>
+        <w:t xml:space="preserve">Validation after execution: </w:t>
+      </w:r>
+    </w:p>
+    <w:p>
+      <w:r>
+        <w:rPr>
+          <w:rFonts w:ascii="Consolas" w:hAnsi="Consolas"/>
+          <w:sz w:val="18"/>
+        </w:rPr>
+        <w:t>Get-AzKeyVault -VaultName "kv-azureosi540118198852" -ResourceGroupName "gipl-slice-ml-india" | Select-Object VaultName, EnableRbacAuthorization, PublicNetworkAccess, EnablePurgeProtection</w:t>
+        <w:br/>
+        <w:t># Expect: PublicNetworkAccess restricted by firewall rule, EnablePurgeProtection = True, EnableRbacAuthorization = True</w:t>
+        <w:br/>
+        <w:t># Also: have azure_osi_ai_models / azure_other_models perform a test secret read immediately after to confirm no breakage</w:t>
+      </w:r>
+    </w:p>
+    <w:p>
+      <w:r>
+        <w:rPr>
+          <w:b/>
+        </w:rPr>
+        <w:t xml:space="preserve">Rollback if issues occur: </w:t>
+      </w:r>
+      <w:r>
+        <w:t>Network rule set: re-run Update-AzKeyVaultNetworkRuleSet -DefaultAction Allow to revert instantly. RBAC migration: revert with -EnableRbacAuthorization:$false (Access Policies are not deleted by the switch, only ignored while RBAC mode is active, so they're available immediately on rollback). Purge protection CANNOT be rolled back once enabled — this is by design (Microsoft does not allow disabling it) and should be the last step taken, only after firewall and RBAC changes are confirmed stable.</w:t>
       </w:r>
     </w:p>
     <w:p/>
+    <w:p>
+      <w:r>
+        <w:rPr>
+          <w:b/>
+          <w:sz w:val="24"/>
+        </w:rPr>
+        <w:t xml:space="preserve">R3 — Stand up centralized logging (Log Analytics workspace + diagnostic settings)  </w:t>
+      </w:r>
+      <w:r>
+        <w:rPr>
+          <w:b/>
+          <w:color w:val="C00000"/>
+        </w:rPr>
+        <w:t>[Critical]</w:t>
+      </w:r>
+    </w:p>
     <w:p>
       <w:r>
         <w:rPr>
@@ -12817,11 +13608,22 @@
       </w:r>
     </w:p>
     <w:p>
-      <w:pPr>
-        <w:pStyle w:val="Heading3"/>
-      </w:pPr>
       <w:r>
-        <w:t>R4/R9 — Disable public network access on named AI/ML resources</w:t>
+        <w:rPr>
+          <w:b/>
+        </w:rPr>
+        <w:t xml:space="preserve">Pre-requisites / sequencing: </w:t>
+      </w:r>
+      <w:r>
+        <w:t>Decide retention period and region (recommend same region as the resource group footprint, e.g. southindia, for latency/compliance) and budget owner for the workspace, since Log Analytics ingestion is a paid service beyond a small free daily allowance — flag the expected cost to management before enabling at scale (see cost note below).</w:t>
+      </w:r>
+    </w:p>
+    <w:p>
+      <w:r>
+        <w:rPr>
+          <w:b/>
+        </w:rPr>
+        <w:t>Remediation command(s):</w:t>
       </w:r>
     </w:p>
     <w:p>
@@ -12830,20 +13632,82 @@
           <w:rFonts w:ascii="Consolas" w:hAnsi="Consolas"/>
           <w:sz w:val="18"/>
         </w:rPr>
-        <w:t># Apply to each of the 10 Cognitive Services accounts listed in Section 8.1:</w:t>
+        <w:t># Step 1: create the workspace (one per subscription recommended)</w:t>
         <w:br/>
-        <w:t>Update-AzCognitiveServicesAccount -ResourceGroupName &lt;rg&gt; -Name &lt;account-name&gt; -PublicNetworkAccess Disabled</w:t>
+        <w:t>New-AzOperationalInsightsWorkspace -ResourceGroupName "gipl-slice-ml-india" -Name "law-gipl-prod" -Location "southindia" -Sku PerGB2018</w:t>
         <w:br/>
-        <w:t># Apply to both ML workspaces:</w:t>
+        <w:t>New-AzOperationalInsightsWorkspace -ResourceGroupName "slice_ml_ds" -Name "law-slicepass-prod" -Location "eastus" -Sku PerGB2018</w:t>
         <w:br/>
-        <w:t>Update-AzMLWorkspace -ResourceGroupName "gipl-slice-ml-india" -Name "azure_osi_ai_models" -PublicNetworkAccess Disabled</w:t>
         <w:br/>
-        <w:t>Update-AzMLWorkspace -ResourceGroupName "gipl-slice-ml-india" -Name "azure_other_models" -PublicNetworkAccess Disabled</w:t>
+        <w:t># Step 2: subscription security contact (free, do alongside this phase)</w:t>
         <w:br/>
-        <w:t># Requires Private Endpoint + Private DNS zone to be provisioned first to avoid breaking access</w:t>
+        <w:t>Set-AzSecurityContact -Name "default1" -Email "security-team@slicebank.com" -AlertNotifications On -AlertsToAdmins On</w:t>
+        <w:br/>
+        <w:br/>
+        <w:t># Step 3: wire diagnostics to the workspace for each named resource (repeat per resource):</w:t>
+        <w:br/>
+        <w:t>$lawId = (Get-AzOperationalInsightsWorkspace -ResourceGroupName "gipl-slice-ml-india" -Name "law-gipl-prod").ResourceId</w:t>
+        <w:br/>
+        <w:t>$kvId = (Get-AzKeyVault -VaultName "kv-azureosi540118198852" -ResourceGroupName "gipl-slice-ml-india").ResourceId</w:t>
+        <w:br/>
+        <w:t>Set-AzDiagnosticSetting -ResourceId $kvId -WorkspaceId $lawId -Enabled $true -Category AuditEvent</w:t>
+        <w:br/>
+        <w:t># Repeat for: siemstorageaccount1, stazureosiai540118198852, all 10 Cognitive Services accounts (Section 8.1), both ML workspaces (Section 8.2)</w:t>
+      </w:r>
+    </w:p>
+    <w:p>
+      <w:r>
+        <w:rPr>
+          <w:b/>
+        </w:rPr>
+        <w:t xml:space="preserve">Validation after execution: </w:t>
+      </w:r>
+    </w:p>
+    <w:p>
+      <w:r>
+        <w:rPr>
+          <w:rFonts w:ascii="Consolas" w:hAnsi="Consolas"/>
+          <w:sz w:val="18"/>
+        </w:rPr>
+        <w:t>Get-AzOperationalInsightsWorkspace</w:t>
+        <w:br/>
+        <w:t># Expect: 2 workspaces returned (one per subscription)</w:t>
+        <w:br/>
+        <w:t>Get-AzDiagnosticSetting -ResourceId $kvId</w:t>
+        <w:br/>
+        <w:t># Expect: a diagnostic setting entry pointing at the new workspace, for each of the 15 resources in Section 4.1</w:t>
+        <w:br/>
+        <w:t># Wait 15-30 minutes, then confirm log flow: Invoke-AzOperationalInsightsQuery -WorkspaceId &lt;law-customer-id&gt; -Query "AzureDiagnostics | take 10"</w:t>
+      </w:r>
+    </w:p>
+    <w:p>
+      <w:r>
+        <w:rPr>
+          <w:b/>
+        </w:rPr>
+        <w:t xml:space="preserve">Rollback if issues occur: </w:t>
+      </w:r>
+      <w:r>
+        <w:t>Diagnostic settings can be individually removed with Remove-AzDiagnosticSetting without affecting the underlying resource. The Log Analytics workspace itself can be deleted with Remove-AzOperationalInsightsWorkspace if the cost/retention decision needs revisiting — no production resource depends on the workspace existing, so this is a low-risk, fully reversible phase.</w:t>
       </w:r>
     </w:p>
     <w:p/>
+    <w:p>
+      <w:r>
+        <w:rPr>
+          <w:b/>
+          <w:sz w:val="24"/>
+        </w:rPr>
+        <w:t xml:space="preserve">R6/R8 — Restrict storage account network access, disable shared key auth, restrict ML workspace public access  </w:t>
+      </w:r>
+      <w:r>
+        <w:rPr>
+          <w:b/>
+          <w:color w:val="E97132"/>
+        </w:rPr>
+        <w:t>[High]</w:t>
+      </w:r>
+    </w:p>
     <w:p>
       <w:r>
         <w:rPr>
@@ -12854,11 +13718,22 @@
       </w:r>
     </w:p>
     <w:p>
-      <w:pPr>
-        <w:pStyle w:val="Heading3"/>
-      </w:pPr>
       <w:r>
-        <w:t>R8 — Restrict storage network access and disable shared key auth</w:t>
+        <w:rPr>
+          <w:b/>
+        </w:rPr>
+        <w:t xml:space="preserve">Pre-requisites / sequencing: </w:t>
+      </w:r>
+      <w:r>
+        <w:t>Confirm with app owners which client/pipeline currently authenticates to stazureosiai540118198852 and siemstorageaccount1 using an access key rather than Azure AD — those clients will break the moment AllowSharedKeyAccess is set to $false and must be migrated to Azure AD-based auth (Storage Blob Data Contributor role, already held by azure_osi_ai_models / azure_other_models) beforehand.</w:t>
+      </w:r>
+    </w:p>
+    <w:p>
+      <w:r>
+        <w:rPr>
+          <w:b/>
+        </w:rPr>
+        <w:t>Remediation command(s):</w:t>
       </w:r>
     </w:p>
     <w:p>
@@ -12867,16 +13742,71 @@
           <w:rFonts w:ascii="Consolas" w:hAnsi="Consolas"/>
           <w:sz w:val="18"/>
         </w:rPr>
-        <w:t>Update-AzStorageAccountNetworkRuleSet -ResourceGroupName "siem" -Name "siemstorageaccount1" -DefaultAction Deny</w:t>
+        <w:t>Update-AzStorageAccountNetworkRuleSet -ResourceGroupName "siem" -Name "siemstorageaccount1" -DefaultAction Deny -Bypass AzureServices</w:t>
         <w:br/>
         <w:t>Set-AzStorageAccount -ResourceGroupName "siem" -Name "siemstorageaccount1" -AllowSharedKeyAccess $false</w:t>
         <w:br/>
-        <w:t>Update-AzStorageAccountNetworkRuleSet -ResourceGroupName "gipl-slice-ml-india" -Name "stazureosiai540118198852" -DefaultAction Deny</w:t>
+        <w:t>Update-AzStorageAccountNetworkRuleSet -ResourceGroupName "gipl-slice-ml-india" -Name "stazureosiai540118198852" -DefaultAction Deny -Bypass AzureServices</w:t>
         <w:br/>
         <w:t>Set-AzStorageAccount -ResourceGroupName "gipl-slice-ml-india" -Name "stazureosiai540118198852" -AllowSharedKeyAccess $false</w:t>
+        <w:br/>
+        <w:br/>
+        <w:t># ML workspace public access — only after Private Endpoint + Private DNS zone are provisioned (see R4/R9 below)</w:t>
+        <w:br/>
+        <w:t>Update-AzMLWorkspace -ResourceGroupName "gipl-slice-ml-india" -Name "azure_osi_ai_models" -PublicNetworkAccess Disabled</w:t>
+        <w:br/>
+        <w:t>Update-AzMLWorkspace -ResourceGroupName "gipl-slice-ml-india" -Name "azure_other_models" -PublicNetworkAccess Disabled</w:t>
+      </w:r>
+    </w:p>
+    <w:p>
+      <w:r>
+        <w:rPr>
+          <w:b/>
+        </w:rPr>
+        <w:t xml:space="preserve">Validation after execution: </w:t>
+      </w:r>
+    </w:p>
+    <w:p>
+      <w:r>
+        <w:rPr>
+          <w:rFonts w:ascii="Consolas" w:hAnsi="Consolas"/>
+          <w:sz w:val="18"/>
+        </w:rPr>
+        <w:t>Get-AzStorageAccount -ResourceGroupName "gipl-slice-ml-india" -Name "stazureosiai540118198852" | Select-Object AllowSharedKeyAccess, @{N="DefaultAction";E={$_.NetworkRuleSet.DefaultAction}}</w:t>
+        <w:br/>
+        <w:t># Expect: AllowSharedKeyAccess = False, DefaultAction = Deny</w:t>
+        <w:br/>
+        <w:t># Then have each dependent pipeline perform a test read/write to confirm AAD-based access still works</w:t>
+      </w:r>
+    </w:p>
+    <w:p>
+      <w:r>
+        <w:rPr>
+          <w:b/>
+        </w:rPr>
+        <w:t xml:space="preserve">Rollback if issues occur: </w:t>
+      </w:r>
+      <w:r>
+        <w:t>Both changes revert instantly: Set-AzStorageAccount ... -AllowSharedKeyAccess $true and Update-AzStorageAccountNetworkRuleSet ... -DefaultAction Allow. Recommend testing in a maintenance window with the dependent pipeline owner on standby for the first attempt.</w:t>
       </w:r>
     </w:p>
     <w:p/>
+    <w:p>
+      <w:r>
+        <w:rPr>
+          <w:b/>
+          <w:sz w:val="24"/>
+        </w:rPr>
+        <w:t xml:space="preserve">R4/R9 — Move all 10 AI accounts and both ML workspaces behind Private Link; disable public access  </w:t>
+      </w:r>
+      <w:r>
+        <w:rPr>
+          <w:b/>
+          <w:color w:val="C00000"/>
+        </w:rPr>
+        <w:t>[Critical]</w:t>
+      </w:r>
+    </w:p>
     <w:p>
       <w:r>
         <w:rPr>
@@ -12887,11 +13817,138 @@
       </w:r>
     </w:p>
     <w:p>
-      <w:pPr>
-        <w:pStyle w:val="Heading3"/>
-      </w:pPr>
       <w:r>
-        <w:t>R11 — Enable Blob Soft Delete (gipl-azure-subscription)</w:t>
+        <w:rPr>
+          <w:b/>
+        </w:rPr>
+        <w:t xml:space="preserve">Pre-requisites / sequencing: </w:t>
+      </w:r>
+      <w:r>
+        <w:t>Highest-change-risk item in this plan. Requires, in order: (1) a VNet/subnet to host Private Endpoints — currently none exists in either subscription, so this is new infrastructure, not a toggle; (2) a Private DNS zone per service type (privatelink.openai.azure.com, privatelink.cognitiveservices.azure.com, privatelink.api.azureml.ms, etc.) linked to that VNet; (3) a Private Endpoint per resource; (4) only then disable public network access. Recommend piloting on one low-traffic account (e.g., dev-poc-ds) before rolling out to production accounts (fraud-ds-prod, merchant-prod-ds).</w:t>
+      </w:r>
+    </w:p>
+    <w:p>
+      <w:r>
+        <w:rPr>
+          <w:b/>
+        </w:rPr>
+        <w:t>Remediation command(s):</w:t>
+      </w:r>
+    </w:p>
+    <w:p>
+      <w:r>
+        <w:rPr>
+          <w:rFonts w:ascii="Consolas" w:hAnsi="Consolas"/>
+          <w:sz w:val="18"/>
+        </w:rPr>
+        <w:t># Step 1: create VNet/subnet (example — adjust CIDR to avoid overlap with any existing ranges)</w:t>
+        <w:br/>
+        <w:t>New-AzVirtualNetwork -ResourceGroupName "gipl-slice-ml-india" -Name "vnet-ai-private" -Location "southindia" -AddressPrefix "10.50.0.0/16"</w:t>
+        <w:br/>
+        <w:t>$vnet = Get-AzVirtualNetwork -ResourceGroupName "gipl-slice-ml-india" -Name "vnet-ai-private"</w:t>
+        <w:br/>
+        <w:t>Add-AzVirtualNetworkSubnetConfig -Name "snet-private-endpoints" -VirtualNetwork $vnet -AddressPrefix "10.50.1.0/24"</w:t>
+        <w:br/>
+        <w:t>$vnet | Set-AzVirtualNetwork</w:t>
+        <w:br/>
+        <w:br/>
+        <w:t># Step 2: pilot on dev-poc-ds first</w:t>
+        <w:br/>
+        <w:t>$subnet = Get-AzVirtualNetworkSubnetConfig -Name "snet-private-endpoints" -VirtualNetwork $vnet</w:t>
+        <w:br/>
+        <w:t>$account = Get-AzCognitiveServicesAccount -ResourceGroupName "slice_ml_ds" -Name "dev-poc-ds"</w:t>
+        <w:br/>
+        <w:t>$plsConnection = New-AzPrivateLinkServiceConnection -Name "pls-dev-poc-ds" -PrivateLinkServiceId $account.Id -GroupId "account"</w:t>
+        <w:br/>
+        <w:t>New-AzPrivateEndpoint -ResourceGroupName "slice_ml_ds" -Name "pe-dev-poc-ds" -Location "southindia" -Subnet $subnet -PrivateLinkServiceConnection $plsConnection</w:t>
+        <w:br/>
+        <w:t># Create + link the matching Private DNS zone, then validate name resolution before disabling public access</w:t>
+        <w:br/>
+        <w:br/>
+        <w:t># Step 3 (after pilot validated): disable public access</w:t>
+        <w:br/>
+        <w:t>Update-AzCognitiveServicesAccount -ResourceGroupName "slice_ml_ds" -Name "dev-poc-ds" -PublicNetworkAccess Disabled</w:t>
+        <w:br/>
+        <w:t># Repeat Steps 2-3 for each remaining account in Section 8.1 and both ML workspaces in Section 8.2, one at a time, in a maintenance window</w:t>
+      </w:r>
+    </w:p>
+    <w:p>
+      <w:r>
+        <w:rPr>
+          <w:b/>
+        </w:rPr>
+        <w:t xml:space="preserve">Validation after execution: </w:t>
+      </w:r>
+    </w:p>
+    <w:p>
+      <w:r>
+        <w:rPr>
+          <w:rFonts w:ascii="Consolas" w:hAnsi="Consolas"/>
+          <w:sz w:val="18"/>
+        </w:rPr>
+        <w:t>Get-AzCognitiveServicesAccount -ResourceGroupName "slice_ml_ds" -Name "dev-poc-ds" | Select-Object PublicNetworkAccess</w:t>
+        <w:br/>
+        <w:t># Expect: Disabled</w:t>
+        <w:br/>
+        <w:t># From within the VNet (or a peered/VPN-connected network): confirm the account's endpoint resolves to a 10.50.1.x private IP and a successful API call works</w:t>
+        <w:br/>
+        <w:t># From outside the VNet: confirm the public endpoint now refuses connections (expected failure)</w:t>
+      </w:r>
+    </w:p>
+    <w:p>
+      <w:r>
+        <w:rPr>
+          <w:b/>
+        </w:rPr>
+        <w:t xml:space="preserve">Rollback if issues occur: </w:t>
+      </w:r>
+      <w:r>
+        <w:t>Each account can be individually reverted with Update-AzCognitiveServicesAccount ... -PublicNetworkAccess Enabled if an integration breaks. Private Endpoints can be removed with Remove-AzPrivateEndpoint without affecting the underlying resource. Recommend keeping public access enabled in parallel with the new Private Endpoint for 48 hours per resource before fully disabling, to allow a fast revert window if an unexpected client breaks.</w:t>
+      </w:r>
+    </w:p>
+    <w:p/>
+    <w:p>
+      <w:r>
+        <w:rPr>
+          <w:b/>
+          <w:sz w:val="24"/>
+        </w:rPr>
+        <w:t xml:space="preserve">R11 — Enable Blob Soft Delete on both storage accounts  </w:t>
+      </w:r>
+      <w:r>
+        <w:rPr>
+          <w:b/>
+          <w:color w:val="E97132"/>
+        </w:rPr>
+        <w:t>[High]</w:t>
+      </w:r>
+    </w:p>
+    <w:p>
+      <w:r>
+        <w:rPr>
+          <w:b/>
+          <w:color w:val="C00000"/>
+        </w:rPr>
+        <w:t>NOT TO BE RUN YET — pending management approval</w:t>
+      </w:r>
+    </w:p>
+    <w:p>
+      <w:r>
+        <w:rPr>
+          <w:b/>
+        </w:rPr>
+        <w:t xml:space="preserve">Pre-requisites / sequencing: </w:t>
+      </w:r>
+      <w:r>
+        <w:t>None — purely additive, no breaking change.</w:t>
+      </w:r>
+    </w:p>
+    <w:p>
+      <w:r>
+        <w:rPr>
+          <w:b/>
+        </w:rPr>
+        <w:t>Remediation command(s):</w:t>
       </w:r>
     </w:p>
     <w:p>
@@ -12905,7 +13962,53 @@
         <w:t>Enable-AzStorageBlobDeleteRetentionPolicy -ResourceGroupName "siem" -StorageAccountName "siemstorageaccount1" -RetentionDays 14</w:t>
       </w:r>
     </w:p>
+    <w:p>
+      <w:r>
+        <w:rPr>
+          <w:b/>
+        </w:rPr>
+        <w:t xml:space="preserve">Validation after execution: </w:t>
+      </w:r>
+    </w:p>
+    <w:p>
+      <w:r>
+        <w:rPr>
+          <w:rFonts w:ascii="Consolas" w:hAnsi="Consolas"/>
+          <w:sz w:val="18"/>
+        </w:rPr>
+        <w:t>Get-AzStorageBlobServiceProperty -ResourceGroupName "gipl-slice-ml-india" -StorageAccountName "stazureosiai540118198852" | Select-Object -ExpandProperty DeleteRetentionPolicy</w:t>
+        <w:br/>
+        <w:t># Expect: Enabled = True, Days = 14</w:t>
+      </w:r>
+    </w:p>
+    <w:p>
+      <w:r>
+        <w:rPr>
+          <w:b/>
+        </w:rPr>
+        <w:t xml:space="preserve">Rollback if issues occur: </w:t>
+      </w:r>
+      <w:r>
+        <w:t>Disable-AzStorageBlobDeleteRetentionPolicy reverts instantly with no data impact.</w:t>
+      </w:r>
+    </w:p>
     <w:p/>
+    <w:p>
+      <w:r>
+        <w:rPr>
+          <w:b/>
+          <w:sz w:val="24"/>
+        </w:rPr>
+        <w:t xml:space="preserve">R10 — Apply resource locks to critical resources  </w:t>
+      </w:r>
+      <w:r>
+        <w:rPr>
+          <w:b/>
+          <w:color w:val="E97132"/>
+        </w:rPr>
+        <w:t>[High]</w:t>
+      </w:r>
+    </w:p>
     <w:p>
       <w:r>
         <w:rPr>
@@ -12916,11 +14019,22 @@
       </w:r>
     </w:p>
     <w:p>
-      <w:pPr>
-        <w:pStyle w:val="Heading3"/>
-      </w:pPr>
       <w:r>
-        <w:t>R10 — Apply resource locks to named critical resources</w:t>
+        <w:rPr>
+          <w:b/>
+        </w:rPr>
+        <w:t xml:space="preserve">Pre-requisites / sequencing: </w:t>
+      </w:r>
+      <w:r>
+        <w:t>None — locks only block delete/write per the chosen LockLevel, no functional impact for CanNotDelete locks on read/write operations.</w:t>
+      </w:r>
+    </w:p>
+    <w:p>
+      <w:r>
+        <w:rPr>
+          <w:b/>
+        </w:rPr>
+        <w:t>Remediation command(s):</w:t>
       </w:r>
     </w:p>
     <w:p>
@@ -12929,16 +14043,64 @@
           <w:rFonts w:ascii="Consolas" w:hAnsi="Consolas"/>
           <w:sz w:val="18"/>
         </w:rPr>
-        <w:t>New-AzResourceLock -LockLevel CanNotDelete -LockName "PreventDelete" -ResourceGroupName "gipl-slice-ml-india" -ResourceName "kv-azureosi540118198852" -ResourceType "Microsoft.KeyVault/vaults"</w:t>
+        <w:t>New-AzResourceLock -LockLevel CanNotDelete -LockName "PreventDelete" -ResourceGroupName "gipl-slice-ml-india" -ResourceName "kv-azureosi540118198852" -ResourceType "Microsoft.KeyVault/vaults" -Force</w:t>
         <w:br/>
-        <w:t>New-AzResourceLock -LockLevel CanNotDelete -LockName "PreventDelete" -ResourceGroupName "gipl-slice-ml-india" -ResourceName "stazureosiai540118198852" -ResourceType "Microsoft.Storage/storageAccounts"</w:t>
+        <w:t>New-AzResourceLock -LockLevel CanNotDelete -LockName "PreventDelete" -ResourceGroupName "gipl-slice-ml-india" -ResourceName "stazureosiai540118198852" -ResourceType "Microsoft.Storage/storageAccounts" -Force</w:t>
         <w:br/>
-        <w:t>New-AzResourceLock -LockLevel CanNotDelete -LockName "PreventDelete" -ResourceGroupName "siem" -ResourceName "siemstorageaccount1" -ResourceType "Microsoft.Storage/storageAccounts"</w:t>
+        <w:t>New-AzResourceLock -LockLevel CanNotDelete -LockName "PreventDelete" -ResourceGroupName "siem" -ResourceName "siemstorageaccount1" -ResourceType "Microsoft.Storage/storageAccounts" -Force</w:t>
         <w:br/>
-        <w:t># Apply similarly to both ML workspaces (azure_osi_ai_models, azure_other_models)</w:t>
+        <w:t>New-AzResourceLock -LockLevel CanNotDelete -LockName "PreventDelete" -ResourceGroupName "gipl-slice-ml-india" -ResourceName "azure_osi_ai_models" -ResourceType "Microsoft.MachineLearningServices/workspaces" -Force</w:t>
+        <w:br/>
+        <w:t>New-AzResourceLock -LockLevel CanNotDelete -LockName "PreventDelete" -ResourceGroupName "gipl-slice-ml-india" -ResourceName "azure_other_models" -ResourceType "Microsoft.MachineLearningServices/workspaces" -Force</w:t>
+      </w:r>
+    </w:p>
+    <w:p>
+      <w:r>
+        <w:rPr>
+          <w:b/>
+        </w:rPr>
+        <w:t xml:space="preserve">Validation after execution: </w:t>
+      </w:r>
+    </w:p>
+    <w:p>
+      <w:r>
+        <w:rPr>
+          <w:rFonts w:ascii="Consolas" w:hAnsi="Consolas"/>
+          <w:sz w:val="18"/>
+        </w:rPr>
+        <w:t>Get-AzResourceLock | Select-Object ResourceName, LockLevel</w:t>
+        <w:br/>
+        <w:t># Expect: 5 rows, one per resource above, LockLevel = CanNotDelete</w:t>
+      </w:r>
+    </w:p>
+    <w:p>
+      <w:r>
+        <w:rPr>
+          <w:b/>
+        </w:rPr>
+        <w:t xml:space="preserve">Rollback if issues occur: </w:t>
+      </w:r>
+      <w:r>
+        <w:t>Remove-AzResourceLock -LockName 'PreventDelete' -ResourceGroupName &lt;rg&gt; -ResourceName &lt;name&gt; -ResourceType &lt;type&gt; removes the lock instantly with no other side effects.</w:t>
       </w:r>
     </w:p>
     <w:p/>
+    <w:p>
+      <w:r>
+        <w:rPr>
+          <w:b/>
+          <w:sz w:val="24"/>
+        </w:rPr>
+        <w:t xml:space="preserve">R7 — Scope down service principal privileges (azure_osi_ai_models, azure_other_models)  </w:t>
+      </w:r>
+      <w:r>
+        <w:rPr>
+          <w:b/>
+          <w:color w:val="E97132"/>
+        </w:rPr>
+        <w:t>[High]</w:t>
+      </w:r>
+    </w:p>
     <w:p>
       <w:r>
         <w:rPr>
@@ -12949,11 +14111,22 @@
       </w:r>
     </w:p>
     <w:p>
-      <w:pPr>
-        <w:pStyle w:val="Heading3"/>
-      </w:pPr>
       <w:r>
-        <w:t>R7 — Scope down service principal privileges</w:t>
+        <w:rPr>
+          <w:b/>
+        </w:rPr>
+        <w:t xml:space="preserve">Pre-requisites / sequencing: </w:t>
+      </w:r>
+      <w:r>
+        <w:t>Requires a short usage audit first: once R3 (logging) has been live for 1–2 weeks, review the actual data-plane actions each SP performs via the new diagnostic logs, then build a custom role containing only those actions before removing the broad Contributor/Key Vault Administrator grants.</w:t>
+      </w:r>
+    </w:p>
+    <w:p>
+      <w:r>
+        <w:rPr>
+          <w:b/>
+        </w:rPr>
+        <w:t>Remediation command(s):</w:t>
       </w:r>
     </w:p>
     <w:p>
@@ -12962,16 +14135,68 @@
           <w:rFonts w:ascii="Consolas" w:hAnsi="Consolas"/>
           <w:sz w:val="18"/>
         </w:rPr>
-        <w:t># Review azure_osi_ai_models and azure_other_models actual usage, then replace broad Contributor</w:t>
+        <w:t># After usage audit confirms which specific actions are needed, example narrowing:</w:t>
         <w:br/>
-        <w:t># grants with narrowly-scoped custom roles limited to the specific data actions each automation flow requires.</w:t>
+        <w:t>$spId = (Get-AzADServicePrincipal -DisplayName "azure_osi_ai_models").Id</w:t>
         <w:br/>
-        <w:t># Example: remove RG-level Contributor once equivalent fine-grained roles are confirmed sufficient:</w:t>
+        <w:t>Remove-AzRoleAssignment -ObjectId $spId -RoleDefinitionName "Contributor" -Scope "/subscriptions/&lt;sub-id&gt;/resourceGroups/gipl-slice-ml-india"</w:t>
         <w:br/>
-        <w:t>Remove-AzRoleAssignment -ObjectId &lt;azure_osi_ai_models-object-id&gt; -RoleDefinitionName "Contributor" -Scope "/subscriptions/&lt;sub-id&gt;/resourceGroups/gipl-slice-ml-india"</w:t>
+        <w:t># Replace with a custom role scoped to only the confirmed-needed actions, e.g.:</w:t>
+        <w:br/>
+        <w:t>New-AzRoleAssignment -ObjectId $spId -RoleDefinitionName "Cognitive Services User" -Scope "/subscriptions/&lt;sub-id&gt;/resourceGroups/gipl-slice-ml-india/providers/Microsoft.CognitiveServices/accounts/de-ml-openai-api"</w:t>
+        <w:br/>
+        <w:t># Repeat the audit-then-narrow process for azure_other_models</w:t>
+      </w:r>
+    </w:p>
+    <w:p>
+      <w:r>
+        <w:rPr>
+          <w:b/>
+        </w:rPr>
+        <w:t xml:space="preserve">Validation after execution: </w:t>
+      </w:r>
+    </w:p>
+    <w:p>
+      <w:r>
+        <w:rPr>
+          <w:rFonts w:ascii="Consolas" w:hAnsi="Consolas"/>
+          <w:sz w:val="18"/>
+        </w:rPr>
+        <w:t>Get-AzRoleAssignment | Where-Object { $_.DisplayName -eq "azure_osi_ai_models" } | Select-Object RoleDefinitionName, Scope</w:t>
+        <w:br/>
+        <w:t># Expect: only the narrowly-scoped roles remain, no RG-level Contributor or Key Vault Administrator</w:t>
+        <w:br/>
+        <w:t># Run a full pipeline/integration test immediately after to confirm nothing broke</w:t>
+      </w:r>
+    </w:p>
+    <w:p>
+      <w:r>
+        <w:rPr>
+          <w:b/>
+        </w:rPr>
+        <w:t xml:space="preserve">Rollback if issues occur: </w:t>
+      </w:r>
+      <w:r>
+        <w:t>Re-grant the original Contributor/Key Vault Administrator roles at RG/resource scope if the narrowed permission set turns out to be insufficient — keep the original role/scope list (Section 2.6) on hand as the rollback reference.</w:t>
       </w:r>
     </w:p>
     <w:p/>
+    <w:p>
+      <w:r>
+        <w:rPr>
+          <w:b/>
+          <w:sz w:val="24"/>
+        </w:rPr>
+        <w:t xml:space="preserve">R12 — Enforce tagging via Azure Policy  </w:t>
+      </w:r>
+      <w:r>
+        <w:rPr>
+          <w:b/>
+          <w:color w:val="FFC000"/>
+        </w:rPr>
+        <w:t>[Medium]</w:t>
+      </w:r>
+    </w:p>
     <w:p>
       <w:r>
         <w:rPr>
@@ -12982,11 +14207,22 @@
       </w:r>
     </w:p>
     <w:p>
-      <w:pPr>
-        <w:pStyle w:val="Heading3"/>
-      </w:pPr>
       <w:r>
-        <w:t>R10/R12 — Enforce tagging via Azure Policy (audit mode initially)</w:t>
+        <w:rPr>
+          <w:b/>
+        </w:rPr>
+        <w:t xml:space="preserve">Pre-requisites / sequencing: </w:t>
+      </w:r>
+      <w:r>
+        <w:t>Decide the required tag taxonomy (e.g., Owner, Environment, CostCenter) with finance/governance before assigning — start in Audit mode so nothing is blocked while gaps are identified.</w:t>
+      </w:r>
+    </w:p>
+    <w:p>
+      <w:r>
+        <w:rPr>
+          <w:b/>
+        </w:rPr>
+        <w:t>Remediation command(s):</w:t>
       </w:r>
     </w:p>
     <w:p>
@@ -12995,27 +14231,17 @@
           <w:rFonts w:ascii="Consolas" w:hAnsi="Consolas"/>
           <w:sz w:val="18"/>
         </w:rPr>
-        <w:t>New-AzPolicyAssignment -Name "require-tag-pod" -PolicyDefinition (Get-AzPolicyDefinition -Name "1e30110a-5ceb-460c-a204-c1c3969c6d62") -Scope "/subscriptions/&lt;sub-id&gt;"</w:t>
+        <w:t>New-AzPolicyAssignment -Name "require-tag-owner" -PolicyDefinition (Get-AzPolicyDefinition -Name "1e30110a-5ceb-460c-a204-c1c3969c6d62") -Scope "/subscriptions/&lt;sub-id&gt;" -PolicyParameterObject @{ tagName = "Owner" }</w:t>
         <w:br/>
-        <w:t># Built-in "Require a tag on resources" definition, deployed in Audit mode initially</w:t>
+        <w:t># Repeat for additional required tags (Environment, CostCenter, etc.), and consider "Append" effect policies to auto-tag rather than just audit</w:t>
       </w:r>
     </w:p>
-    <w:p/>
     <w:p>
       <w:r>
         <w:rPr>
           <w:b/>
-          <w:color w:val="C00000"/>
         </w:rPr>
-        <w:t>NOT TO BE RUN YET — pending management approval</w:t>
-      </w:r>
-    </w:p>
-    <w:p>
-      <w:pPr>
-        <w:pStyle w:val="Heading3"/>
-      </w:pPr>
-      <w:r>
-        <w:t>R3 — Subscription security contact (free, zero risk)</w:t>
+        <w:t xml:space="preserve">Validation after execution: </w:t>
       </w:r>
     </w:p>
     <w:p>
@@ -13024,7 +14250,20 @@
           <w:rFonts w:ascii="Consolas" w:hAnsi="Consolas"/>
           <w:sz w:val="18"/>
         </w:rPr>
-        <w:t>Set-AzSecurityContact -Name "default1" -Email "security-team@slicebank.com" -AlertNotifications On -AlertsToAdmins On</w:t>
+        <w:t>Get-AzPolicyAssignment -Name "require-tag-owner"</w:t>
+        <w:br/>
+        <w:t># Then after 24h propagation: Get-AzPolicyState -Filter "PolicyAssignmentName eq 'require-tag-owner'" | Group-Object ComplianceState</w:t>
+      </w:r>
+    </w:p>
+    <w:p>
+      <w:r>
+        <w:rPr>
+          <w:b/>
+        </w:rPr>
+        <w:t xml:space="preserve">Rollback if issues occur: </w:t>
+      </w:r>
+      <w:r>
+        <w:t>Remove-AzPolicyAssignment -Name 'require-tag-owner' -Scope &lt;scope&gt; removes the assignment instantly; since it starts in Audit mode, there is no enforcement risk during the initial rollout.</w:t>
       </w:r>
     </w:p>
     <w:p/>

</xml_diff>